<commit_message>
fix: enforce rigid scaffold tie construction
</commit_message>
<xml_diff>
--- a/oracle/platform-suite-20261027/03_scaffold-tie-member_连墙件计算.docx
+++ b/oracle/platform-suite-20261027/03_scaffold-tie-member_连墙件计算.docx
@@ -2030,7 +2030,7 @@
           <w:b w:val="0"/>
           <w:sz w:val="19"/>
         </w:rPr>
-        <w:t>结果：1 — = 1 → 满足要求</w:t>
+        <w:t>结果：满足要求</w:t>
       </w:r>
     </w:p>
     <w:p>
@@ -2043,48 +2043,7 @@
           <w:b/>
           <w:sz w:val="22"/>
         </w:rPr>
-        <w:t>10. 单排架体高度</w:t>
-      </w:r>
-      <w:r>
-        <w:rPr>
-          <w:rFonts w:ascii="宋体" w:hAnsi="宋体" w:eastAsia="宋体"/>
-          <w:b w:val="0"/>
-          <w:sz w:val="18"/>
-        </w:rPr>
-        <w:t>（JGJ 130-2011 6.1.2）</w:t>
-      </w:r>
-    </w:p>
-    <w:p>
-      <w:r>
-        <w:rPr>
-          <w:rFonts w:ascii="宋体" w:hAnsi="宋体" w:eastAsia="宋体"/>
-          <w:b w:val="0"/>
-          <w:sz w:val="19"/>
-        </w:rPr>
-        <w:t>公式：单排≤24m（当前非单排）</w:t>
-      </w:r>
-    </w:p>
-    <w:p>
-      <w:r>
-        <w:rPr>
-          <w:rFonts w:ascii="宋体" w:hAnsi="宋体" w:eastAsia="宋体"/>
-          <w:b w:val="0"/>
-          <w:sz w:val="19"/>
-        </w:rPr>
-        <w:t>结果：24 m = 24 → 满足要求</w:t>
-      </w:r>
-    </w:p>
-    <w:p>
-      <w:pPr>
-        <w:spacing w:before="160"/>
-      </w:pPr>
-      <w:r>
-        <w:rPr>
-          <w:rFonts w:ascii="宋体" w:hAnsi="宋体" w:eastAsia="宋体"/>
-          <w:b/>
-          <w:sz w:val="22"/>
-        </w:rPr>
-        <w:t>11. 软拉硬撑适用高度</w:t>
+        <w:t>10. 连墙件刚性构造</w:t>
       </w:r>
       <w:r>
         <w:rPr>
@@ -2102,7 +2061,7 @@
           <w:b w:val="0"/>
           <w:sz w:val="19"/>
         </w:rPr>
-        <w:t>公式：连墙件应为刚性构造，软拉硬撑仅在≤24m时允许且刚性构造优先</w:t>
+        <w:t>公式：GB 55023-2022 第4.4.6条强制要求连墙件为可拉压的刚性构件；当前连接方式不是软拉硬撑，满足刚性构造要求。JGJ 130-2011 仅限制 H&gt;24m 时不得采用软拉硬撑，GB 55023-2022 的要求更严。</w:t>
       </w:r>
     </w:p>
     <w:p>
@@ -2112,7 +2071,7 @@
           <w:b w:val="0"/>
           <w:sz w:val="19"/>
         </w:rPr>
-        <w:t>结果：0 — ≤ 1 → 满足要求</w:t>
+        <w:t>结果：满足要求</w:t>
       </w:r>
     </w:p>
     <w:p>
@@ -2127,7 +2086,7 @@
           <w:color w:val="000000"/>
           <w:sz w:val="28"/>
         </w:rPr>
-        <w:t>三、内力与变形图</w:t>
+        <w:t>三、计算图</w:t>
       </w:r>
     </w:p>
     <w:p>
@@ -3430,7 +3389,7 @@
                 <w:b w:val="0"/>
                 <w:sz w:val="21"/>
               </w:rPr>
-              <w:t>单排架体高度</w:t>
+              <w:t>连墙件刚性构造</w:t>
             </w:r>
           </w:p>
         </w:tc>
@@ -3446,121 +3405,7 @@
                 <w:b w:val="0"/>
                 <w:sz w:val="21"/>
               </w:rPr>
-              <w:t>24.0</w:t>
-            </w:r>
-          </w:p>
-        </w:tc>
-        <w:tc>
-          <w:tcPr>
-            <w:tcW w:type="dxa" w:w="1134"/>
-          </w:tcPr>
-          <w:p>
-            <w:r/>
-            <w:r>
-              <w:rPr>
-                <w:rFonts w:ascii="宋体" w:hAnsi="宋体" w:eastAsia="宋体"/>
-                <w:b w:val="0"/>
-                <w:sz w:val="21"/>
-              </w:rPr>
-              <w:t>24.0</w:t>
-            </w:r>
-          </w:p>
-        </w:tc>
-        <w:tc>
-          <w:tcPr>
-            <w:tcW w:type="dxa" w:w="1020"/>
-          </w:tcPr>
-          <w:p>
-            <w:r/>
-            <w:r>
-              <w:rPr>
-                <w:rFonts w:ascii="宋体" w:hAnsi="宋体" w:eastAsia="宋体"/>
-                <w:b w:val="0"/>
-                <w:sz w:val="21"/>
-              </w:rPr>
-              <w:t>100%</w:t>
-            </w:r>
-          </w:p>
-        </w:tc>
-        <w:tc>
-          <w:tcPr>
-            <w:tcW w:type="dxa" w:w="1247"/>
-          </w:tcPr>
-          <w:p>
-            <w:r/>
-            <w:r>
-              <w:rPr>
-                <w:rFonts w:ascii="宋体" w:hAnsi="宋体" w:eastAsia="宋体"/>
-                <w:b w:val="0"/>
-                <w:sz w:val="21"/>
-              </w:rPr>
-              <w:t>满足要求</w:t>
-            </w:r>
-          </w:p>
-        </w:tc>
-        <w:tc>
-          <w:tcPr>
-            <w:tcW w:type="dxa" w:w="2381"/>
-          </w:tcPr>
-          <w:p>
-            <w:r/>
-            <w:r>
-              <w:rPr>
-                <w:rFonts w:ascii="宋体" w:hAnsi="宋体" w:eastAsia="宋体"/>
-                <w:b w:val="0"/>
-                <w:sz w:val="21"/>
-              </w:rPr>
-              <w:t>JGJ 130-2011 6.1.2</w:t>
-            </w:r>
-          </w:p>
-        </w:tc>
-      </w:tr>
-      <w:tr>
-        <w:tc>
-          <w:tcPr>
-            <w:tcW w:type="dxa" w:w="680"/>
-          </w:tcPr>
-          <w:p>
-            <w:r/>
-            <w:r>
-              <w:rPr>
-                <w:rFonts w:ascii="宋体" w:hAnsi="宋体" w:eastAsia="宋体"/>
-                <w:b w:val="0"/>
-                <w:sz w:val="21"/>
-              </w:rPr>
-              <w:t>11</w:t>
-            </w:r>
-          </w:p>
-        </w:tc>
-        <w:tc>
-          <w:tcPr>
-            <w:tcW w:type="dxa" w:w="2721"/>
-          </w:tcPr>
-          <w:p>
-            <w:r/>
-            <w:r>
-              <w:rPr>
-                <w:rFonts w:ascii="宋体" w:hAnsi="宋体" w:eastAsia="宋体"/>
-                <w:b w:val="0"/>
-                <w:sz w:val="21"/>
-              </w:rPr>
-              <w:t>软拉硬撑适用高度</w:t>
-            </w:r>
-          </w:p>
-        </w:tc>
-        <w:tc>
-          <w:tcPr>
-            <w:tcW w:type="dxa" w:w="1247"/>
-          </w:tcPr>
-          <w:p>
-            <w:r/>
-            <w:r>
-              <w:rPr>
-                <w:rFonts w:ascii="宋体" w:hAnsi="宋体" w:eastAsia="宋体"/>
-                <w:b w:val="0"/>
-                <w:sz w:val="21"/>
-              </w:rPr>
-              <w:t>0.0</w:t>
+              <w:t>1.0</w:t>
             </w:r>
           </w:p>
         </w:tc>
@@ -3592,7 +3437,7 @@
                 <w:b w:val="0"/>
                 <w:sz w:val="21"/>
               </w:rPr>
-              <w:t>0%</w:t>
+              <w:t>100%</w:t>
             </w:r>
           </w:p>
         </w:tc>
@@ -3652,7 +3497,7 @@
           <w:b w:val="0"/>
           <w:sz w:val="21"/>
         </w:rPr>
-        <w:t>本次验算共 11 项，其中 1 项不满足：连墙件扣件抗滑。</w:t>
+        <w:t>本次验算共 10 项，其中 1 项不满足：连墙件扣件抗滑。</w:t>
       </w:r>
     </w:p>
     <w:p>
@@ -3745,7 +3590,7 @@
           <w:b w:val="0"/>
           <w:sz w:val="19"/>
         </w:rPr>
-        <w:t>H&gt;24m 的软拉硬撑判定不满足；H≤24m 仍优先采用刚性连墙构造</w:t>
+        <w:t>GB 55023-2022 第4.4.6条为强制性条文，连墙件必须是可拉压的刚性构件；软拉硬撑在任何高度均判定不满足，较 JGJ 130-2011 仅限制 H&gt;24m 更严</w:t>
       </w:r>
     </w:p>
     <w:p>

</xml_diff>

<commit_message>
fix: enforce scaffold tie design limits
</commit_message>
<xml_diff>
--- a/oracle/platform-suite-20261027/03_scaffold-tie-member_连墙件计算.docx
+++ b/oracle/platform-suite-20261027/03_scaffold-tie-member_连墙件计算.docx
@@ -1733,7 +1733,7 @@
           <w:b w:val="0"/>
           <w:sz w:val="19"/>
         </w:rPr>
-        <w:t>公式：Nl/(φA) ≤ 0.85f；λ=56.4，φ=0.832</w:t>
+        <w:t>公式：Nl/(φA) ≤ 0.85f；λ=56.4≤250，按附录 A 表 A.0.6 查取 φ=0.832</w:t>
       </w:r>
     </w:p>
     <w:p>
@@ -1856,7 +1856,7 @@
           <w:b w:val="0"/>
           <w:sz w:val="19"/>
         </w:rPr>
-        <w:t>公式：tieVerticalSpacing/h=3.60/1.80 ≤ 3 步</w:t>
+        <w:t>公式：tieVerticalSpacing/h=3.60/1.80=2.00 ≤ 3 步</w:t>
       </w:r>
     </w:p>
     <w:p>
@@ -3538,7 +3538,7 @@
           <w:b w:val="0"/>
           <w:sz w:val="19"/>
         </w:rPr>
-        <w:t>tieNetArea=0，当前强度按毛截面计算；后续应以实际净截面复核</w:t>
+        <w:t>f=205N/mm²、Rc=8.0kN 取自 JGJ 130-2011；φ 仅按附录 A 表 A.0.6 的 λ=0～250 范围查取，超限直接报错，不截断为端点值</w:t>
       </w:r>
     </w:p>
     <w:p>
@@ -3551,7 +3551,20 @@
           <w:b w:val="0"/>
           <w:sz w:val="19"/>
         </w:rPr>
-        <w:t>f=205N/mm²、Rc=8.0kN 取自 JGJ 130-2011；φ 按附录 A 表 A.0.6 查取</w:t>
+        <w:t>连墙件竖向间距一般不超过 3 步；双排悬挑且 H&gt;50m 时按表 6.4.2 收紧为不超过 2 步</w:t>
+      </w:r>
+    </w:p>
+    <w:p>
+      <w:pPr>
+        <w:pStyle w:val="ListBullet"/>
+      </w:pPr>
+      <w:r>
+        <w:rPr>
+          <w:rFonts w:ascii="宋体" w:hAnsi="宋体" w:eastAsia="宋体"/>
+          <w:b w:val="0"/>
+          <w:sz w:val="19"/>
+        </w:rPr>
+        <w:t>tieNetArea&gt;0 时必须采用不大于钢管毛截面 A 的实际净截面；tieNetArea=0 时按毛截面计算并应在后续复核</w:t>
       </w:r>
     </w:p>
     <w:p>

</xml_diff>